<commit_message>
fix(hypnose): corrige la leçon 15 et durcit le prompt — revue de Snyder rendue à sa notice (IJCEH), traduction sympathovagale redressée, revue narrative et cas Marsh liés et recopiés de leur résumé, exercice 2 déclaré variante et non protocole de Rasch ; A4 + nom de revue, A5 (le verbe suit le titre), A6 (liste et protocole), étape 5 bis à quatre motifs (validée dans les deux sens)
Co-Authored-By: Claude Opus 5 <noreply@anthropic.com>
</commit_message>
<xml_diff>
--- a/livrables/lecons/2026-09-22_lecon-hypnose_15_hypnose-troubles-sommeil.docx
+++ b/livrables/lecons/2026-09-22_lecon-hypnose_15_hypnose-troubles-sommeil.docx
@@ -488,7 +488,18 @@
           <w:sz w:val="22"/>
           <w:szCs w:val="22"/>
         </w:rPr>
-        <w:t xml:space="preserve">Besedovsky, Cordi, Wißlicen, Martínez-Albert, Born &amp; Rasch (2022, Communications Biology) ont montré que des suggestions hypnotiques présentées au début d'une sieste de 90 minutes augmentaient la sécrétion d'hormone de croissance (GH), et dans une moindre mesure de prolactine et d'aldostérone, tout en déplaçant l'équilibre sympathovagal vers une prédominance parasympathique réduite. Ces effets sont caractéristiques du sommeil lent profond naturel. (Source vérifiée dans PMC9325885, 61 385 caractères)</w:t>
+        <w:t xml:space="preserve">Besedovsky, Cordi, Wißlicen, Martínez-Albert, Born &amp; Rasch (2022, Communications Biology) ont montré que des suggestions hypnotiques présentées au début d'une sieste de 90 minutes augmentaient la sécrétion d'hormone de croissance (GH), et dans une moindre mesure de prolactine et d'aldostérone, tout en déplaçant l'équilibre sympathovagal vers une prédominance sympathique réduite — c'est-à-dire vers le parasympathique. Ces effets sont caractéristiques du sommeil lent profond naturel. (Source vérifiée dans PMC9325885, 61 385 caractères)</w:t>
+      </w:r>
+      <w:r>
+        <w:rPr>
+          <w:rFonts w:ascii="Times New Roman" w:cs="Times New Roman" w:eastAsia="Times New Roman" w:hAnsi="Times New Roman"/>
+          <w:i/>
+          <w:iCs/>
+          <w:color w:val="6B7280"/>
+          <w:sz w:val="20"/>
+          <w:szCs w:val="20"/>
+        </w:rPr>
+        <w:t xml:space="preserve"> [Corrigé le 22/09/2026 : l'article écrit « shifted the sympathovagal balance towards reduced sympathetic predominance » ; la phrase française disait l'inverse, une prédominance parasympathique en baisse.]</w:t>
       </w:r>
     </w:p>
     <w:p>
@@ -585,43 +596,126 @@
           <w:sz w:val="22"/>
           <w:szCs w:val="22"/>
         </w:rPr>
-        <w:t xml:space="preserve">Sur l'insomnie au sens clinique, les résultats sont prometteurs mais restent hétérogènes. Une revue narrative publiée dans Complementary Therapies in Medicine (2022) a identifié les principales limites méthodologiques du champ : petits échantillons, absence de groupes contrôle, méthodes inconsistantes, focus sur le court terme, et biais de publication.</w:t>
-      </w:r>
-    </w:p>
-    <w:p>
-      <w:pPr>
-        <w:spacing w:after="60" w:before="60"/>
-      </w:pPr>
-      <w:r>
-        <w:rPr>
-          <w:rFonts w:ascii="Times New Roman" w:cs="Times New Roman" w:eastAsia="Times New Roman" w:hAnsi="Times New Roman"/>
-          <w:b w:val="false"/>
-          <w:bCs w:val="false"/>
-          <w:i w:val="false"/>
-          <w:iCs w:val="false"/>
-          <w:color w:val="1F2937"/>
-          <w:sz w:val="22"/>
-          <w:szCs w:val="22"/>
-        </w:rPr>
-        <w:t xml:space="preserve">Snyder, Alldredge, Stork &amp; Elkins (2023, American Journal of Clinical Hypnosis) ont publié une étude de faisabilité d'une intervention d'auto-hypnose auto-administrée auprès de 22 étudiants rapportant une mauvaise qualité de sommeil : sur 4 semaines (1 de base + 3 d'intervention), la latence d'endormissement et l'efficacité du sommeil mesurées par actigraphie se sont améliorées significativement. La durée moyenne de sommeil nocturne pendant la semaine de base était de 398,88 minutes. (Source vérifiée dans PMC10646898)</w:t>
-      </w:r>
-    </w:p>
-    <w:p>
-      <w:pPr>
-        <w:spacing w:after="60" w:before="60"/>
-      </w:pPr>
-      <w:r>
-        <w:rPr>
-          <w:rFonts w:ascii="Times New Roman" w:cs="Times New Roman" w:eastAsia="Times New Roman" w:hAnsi="Times New Roman"/>
-          <w:b w:val="false"/>
-          <w:bCs w:val="false"/>
-          <w:i w:val="false"/>
-          <w:iCs w:val="false"/>
-          <w:color w:val="1F2937"/>
-          <w:sz w:val="22"/>
-          <w:szCs w:val="22"/>
-        </w:rPr>
-        <w:t xml:space="preserve">Pour les parasomnies (somniloquie, somnambulisme), des cas cliniques documentent des résultats positifs de l'hypnothérapie — notamment Marsh (2026, Frontiers in Sleep) sur la somniloquie chronique (8 séances bi-hebdomadaires) — mais ces données restent au niveau du cas clinique, sans généralisation possible.</w:t>
+        <w:t xml:space="preserve">Sur l'insomnie au sens clinique, les résultats sont prometteurs mais restent hétérogènes. La revue narrative de Mamoune, Mener, Chapron &amp; Poimboeuf (2022, Complementary Therapies in Medicine — </w:t>
+      </w:r>
+      <w:hyperlink w:history="1" r:id="rIdC15rev">
+        <w:r>
+          <w:rPr>
+            <w:rFonts w:ascii="Times New Roman" w:cs="Times New Roman" w:eastAsia="Times New Roman" w:hAnsi="Times New Roman"/>
+            <w:color w:val="1155CC"/>
+            <w:sz w:val="22"/>
+            <w:szCs w:val="22"/>
+            <w:u w:val="single"/>
+          </w:rPr>
+          <w:t xml:space="preserve">notice PubMed 35074550</w:t>
+        </w:r>
+      </w:hyperlink>
+      <w:r>
+        <w:rPr>
+          <w:rFonts w:ascii="Times New Roman" w:cs="Times New Roman" w:eastAsia="Times New Roman" w:hAnsi="Times New Roman"/>
+          <w:b w:val="false"/>
+          <w:bCs w:val="false"/>
+          <w:i w:val="false"/>
+          <w:iCs w:val="false"/>
+          <w:color w:val="1F2937"/>
+          <w:sz w:val="22"/>
+          <w:szCs w:val="22"/>
+        </w:rPr>
+        <w:t xml:space="preserve">) a retenu 25 études — 10 études de cas, 11 essais randomisés contrôlés, 4 études pré/post — et relève : des designs, interventions, contrôles et comparateurs hétérogènes, des définitions et des techniques d'hypnose elles aussi hétérogènes et insuffisamment décrites, des critères de mesure le plus souvent non quantifiables, des effectifs trop petits pour être significatifs ou représentatifs, et aucune étude en double aveugle. Sa conclusion : la recherche sur l'efficacité de l'hypnose contre l'insomnie manque d'éléments méthodologiques clés. </w:t>
+      </w:r>
+      <w:r>
+        <w:rPr>
+          <w:rFonts w:ascii="Times New Roman" w:cs="Times New Roman" w:eastAsia="Times New Roman" w:hAnsi="Times New Roman"/>
+          <w:i/>
+          <w:iCs/>
+          <w:color w:val="6B7280"/>
+          <w:sz w:val="20"/>
+          <w:szCs w:val="20"/>
+        </w:rPr>
+        <w:t xml:space="preserve">[Corrigé le 22/09/2026 : la leçon listait « petits échantillons, absence de groupes contrôle, méthodes inconsistantes, focus sur le court terme, et biais de publication » sous une revue nommée sans ses auteurs ni son lien : onze des vingt-cinq études sont des essais contrôlés, le court terme et le biais de publication ne sont pas dans le résumé, et l'absence de double aveugle y manquait.]</w:t>
+      </w:r>
+    </w:p>
+    <w:p>
+      <w:pPr>
+        <w:spacing w:after="60" w:before="60"/>
+      </w:pPr>
+      <w:r>
+        <w:rPr>
+          <w:rFonts w:ascii="Times New Roman" w:cs="Times New Roman" w:eastAsia="Times New Roman" w:hAnsi="Times New Roman"/>
+          <w:b w:val="false"/>
+          <w:bCs w:val="false"/>
+          <w:i w:val="false"/>
+          <w:iCs w:val="false"/>
+          <w:color w:val="1F2937"/>
+          <w:sz w:val="22"/>
+          <w:szCs w:val="22"/>
+        </w:rPr>
+        <w:t xml:space="preserve">Snyder, Alldredge, Stork &amp; Elkins (2023, International Journal of Clinical and Experimental Hypnosis) ont publié une étude de faisabilité d'une intervention d'auto-hypnose auto-administrée auprès de 22 étudiants rapportant une mauvaise qualité de sommeil : sur 4 semaines (1 de base + 3 d'intervention), la latence d'endormissement et l'efficacité du sommeil mesurées par actigraphie se sont améliorées significativement ; en revanche, la durée de sommeil objective n'a pas changé de façon significative (p = 0,24), ce que les auteurs rappellent en concluant qu'un essai randomisé de plus grande ampleur reste nécessaire. La durée moyenne de sommeil nocturne pendant la semaine de base était de 398,88 minutes. (Source vérifiée dans PMC10646898)</w:t>
+      </w:r>
+      <w:r>
+        <w:rPr>
+          <w:rFonts w:ascii="Times New Roman" w:cs="Times New Roman" w:eastAsia="Times New Roman" w:hAnsi="Times New Roman"/>
+          <w:i/>
+          <w:iCs/>
+          <w:color w:val="6B7280"/>
+          <w:sz w:val="20"/>
+          <w:szCs w:val="20"/>
+        </w:rPr>
+        <w:t xml:space="preserve"> [Corrigé le 22/09/2026 : la leçon donnait l'American Journal of Clinical Hypnosis ; la notice (PMC10646898, Europe PMC) donne l'International Journal of Clinical and Experimental Hypnosis. Le résultat non significatif sur la durée manquait.]</w:t>
+      </w:r>
+    </w:p>
+    <w:p>
+      <w:pPr>
+        <w:spacing w:after="60" w:before="60"/>
+      </w:pPr>
+      <w:r>
+        <w:rPr>
+          <w:rFonts w:ascii="Times New Roman" w:cs="Times New Roman" w:eastAsia="Times New Roman" w:hAnsi="Times New Roman"/>
+          <w:b w:val="false"/>
+          <w:bCs w:val="false"/>
+          <w:i w:val="false"/>
+          <w:iCs w:val="false"/>
+          <w:color w:val="1F2937"/>
+          <w:sz w:val="22"/>
+          <w:szCs w:val="22"/>
+        </w:rPr>
+        <w:t xml:space="preserve">Pour les parasomnies (somniloquie, somnambulisme), des cas cliniques documentent des résultats positifs de l'hypnothérapie — notamment Marsh (2026, Frontiers in Sleep — </w:t>
+      </w:r>
+      <w:hyperlink w:history="1" r:id="rIdC15marsh">
+        <w:r>
+          <w:rPr>
+            <w:rFonts w:ascii="Times New Roman" w:cs="Times New Roman" w:eastAsia="Times New Roman" w:hAnsi="Times New Roman"/>
+            <w:color w:val="1155CC"/>
+            <w:sz w:val="22"/>
+            <w:szCs w:val="22"/>
+            <w:u w:val="single"/>
+          </w:rPr>
+          <w:t xml:space="preserve">case report, DOI 10.3389/frsle.2026.1707583</w:t>
+        </w:r>
+      </w:hyperlink>
+      <w:r>
+        <w:rPr>
+          <w:rFonts w:ascii="Times New Roman" w:cs="Times New Roman" w:eastAsia="Times New Roman" w:hAnsi="Times New Roman"/>
+          <w:b w:val="false"/>
+          <w:bCs w:val="false"/>
+          <w:i w:val="false"/>
+          <w:iCs w:val="false"/>
+          <w:color w:val="1F2937"/>
+          <w:sz w:val="22"/>
+          <w:szCs w:val="22"/>
+        </w:rPr>
+        <w:t xml:space="preserve">) chez un homme de 46 ans souffrant de somniloquie chronique depuis des décennies : un plan de huit séances bi-hebdomadaires, interrompu dès la sixième parce que l'épouse ne signalait presque plus de paroles nocturnes — mais ces données restent au niveau du cas clinique, sans généralisation possible. </w:t>
+      </w:r>
+      <w:r>
+        <w:rPr>
+          <w:rFonts w:ascii="Times New Roman" w:cs="Times New Roman" w:eastAsia="Times New Roman" w:hAnsi="Times New Roman"/>
+          <w:i/>
+          <w:iCs/>
+          <w:color w:val="6B7280"/>
+          <w:sz w:val="20"/>
+          <w:szCs w:val="20"/>
+        </w:rPr>
+        <w:t xml:space="preserve">[Corrigé le 22/09/2026 : « 8 séances bi-hebdomadaires » était le plan, pas la dose reçue ; le cas et son arrêt anticipé sont ajoutés, avec le lien.]</w:t>
       </w:r>
     </w:p>
     <w:p>
@@ -812,7 +906,18 @@
           <w:sz w:val="22"/>
           <w:szCs w:val="22"/>
         </w:rPr>
-        <w:t xml:space="preserve">Cette séance utilise une métaphore de descente progressive, adaptée de la technique validée par l'équipe de Rasch (imagerie d'approfondissement). Elle est à pratiquer dans le lit, lumières éteintes, juste avant le coucher — ou en sieste de milieu de journée.</w:t>
+        <w:t xml:space="preserve">Cette séance utilise une métaphore de descente progressive. ⚠️ Ce n'est PAS le protocole de l'équipe de Rasch : dans leurs études, l'imagerie était celle d'un dauphin que l'on suit en plongeant vers le fond de la mer, accompagnée de suggestions de sécurité, de relâchement et de sommeil ; et une étude de contrôle a montré qu'une imagerie sans suggestions de sommeil ni de sécurité — un bateau flottant en surface — n'allongeait PAS le sommeil lent profond (Rasch, encyclopédie ISH). L'escalier ci-dessous est une variante personnelle : ce qui doit être conservé, ce sont les suggestions de descente, de sécurité et de sommeil. Elle est à pratiquer dans le lit, lumières éteintes, juste avant le coucher — ou en sieste de milieu de journée. </w:t>
+      </w:r>
+      <w:r>
+        <w:rPr>
+          <w:rFonts w:ascii="Times New Roman" w:cs="Times New Roman" w:eastAsia="Times New Roman" w:hAnsi="Times New Roman"/>
+          <w:i/>
+          <w:iCs/>
+          <w:color w:val="6B7280"/>
+          <w:sz w:val="20"/>
+          <w:szCs w:val="20"/>
+        </w:rPr>
+        <w:t xml:space="preserve">[Corrigé le 22/09/2026 : la séance était présentée comme « adaptée de la technique validée par l'équipe de Rasch », alors que la source dit expérimentalement que le contenu de l'imagerie n'est pas interchangeable.]</w:t>
       </w:r>
     </w:p>
     <w:p>
@@ -1104,6 +1209,17 @@
         </w:rPr>
         <w:t xml:space="preserve">Note de pratique : si après 3-4 tentatives (sur des nuits différentes) cette technique n'aide pas à l'endormissement, ne pas insister. La règle de Cordi &amp; Rasch s'applique : pour les personnes à faible hypnotisabilité, une écoute musicale ou une relaxation corporelle progressive sera plus efficace.</w:t>
       </w:r>
+      <w:r>
+        <w:rPr>
+          <w:rFonts w:ascii="Times New Roman" w:cs="Times New Roman" w:eastAsia="Times New Roman" w:hAnsi="Times New Roman"/>
+          <w:i/>
+          <w:iCs/>
+          <w:color w:val="6B7280"/>
+          <w:sz w:val="20"/>
+          <w:szCs w:val="20"/>
+        </w:rPr>
+        <w:t xml:space="preserve"> Et ne pas transformer la séance en effort : Combertaldi &amp; Rasch (2020) ont montré que vouloir mieux dormir sans hypnose ne suffit pas et peut même dégrader le sommeil (cité par Rasch, encyclopédie ISH). [Corrigé le 22/09/2026 : la consigne « ne pas attendre de s'endormir à la commande » n'avait pas de source ; celle-ci est sur la page ISH déjà citée.]</w:t>
+      </w:r>
     </w:p>
     <w:p>
       <w:pPr>
@@ -1137,7 +1253,18 @@
           <w:sz w:val="22"/>
           <w:szCs w:val="22"/>
         </w:rPr>
-        <w:t xml:space="preserve">Cet exercice travaille sur la perception du sommeil — un aspect souvent négligé mais important. Cordi &amp; Rasch (2022) ont montré que les personnes à haute hypnotisabilité ont une meilleure corrélation entre leur sommeil perçu (profondeur déclarée) et leur SWS réel mesuré en laboratoire. Cela suggère que la conscience intéroceptive du sommeil est une compétence développable.</w:t>
+        <w:t xml:space="preserve">Cet exercice travaille sur la perception du sommeil — un aspect souvent négligé mais important. Cordi &amp; Rasch (2022, International Journal of Clinical and Experimental Hypnosis) suggèrent, dans une étude qualifiée d'exploratoire par son titre même, que l'hypnotisabilité pourrait être liée à la capacité intéroceptive de percevoir correctement la profondeur du sommeil. Cela suggère que la conscience intéroceptive du sommeil est une compétence développable.</w:t>
+      </w:r>
+      <w:r>
+        <w:rPr>
+          <w:rFonts w:ascii="Times New Roman" w:cs="Times New Roman" w:eastAsia="Times New Roman" w:hAnsi="Times New Roman"/>
+          <w:i/>
+          <w:iCs/>
+          <w:color w:val="6B7280"/>
+          <w:sz w:val="20"/>
+          <w:szCs w:val="20"/>
+        </w:rPr>
+        <w:t xml:space="preserve"> [Corrigé le 22/09/2026 : « ont montré » pour un article intitulé « Hypnotizability may relate to interoceptive ability to accurately perceive sleep depth: An exploratory study » ; référence ajoutée aux ressources.]</w:t>
       </w:r>
     </w:p>
     <w:p>
@@ -1488,7 +1615,7 @@
           <w:sz w:val="22"/>
           <w:szCs w:val="22"/>
         </w:rPr>
-        <w:t xml:space="preserve"> — American Journal of Clinical Hypnosis. Auto-hypnose et amélioration actigraphique du sommeil. (HTTP 200 ✅)</w:t>
+        <w:t xml:space="preserve"> — International Journal of Clinical and Experimental Hypnosis. Auto-hypnose et amélioration actigraphique du sommeil. (HTTP 200 ✅)</w:t>
       </w:r>
     </w:p>
     <w:p>
@@ -1539,6 +1666,96 @@
       <w:pPr>
         <w:spacing w:after="60" w:before="60"/>
       </w:pPr>
+      <w:hyperlink w:history="1" r:id="rIdC15rev">
+        <w:r>
+          <w:rPr>
+            <w:rFonts w:ascii="Times New Roman" w:cs="Times New Roman" w:eastAsia="Times New Roman" w:hAnsi="Times New Roman"/>
+            <w:color w:val="1155CC"/>
+            <w:sz w:val="22"/>
+            <w:szCs w:val="22"/>
+            <w:u w:val="single"/>
+          </w:rPr>
+          <w:t xml:space="preserve">Mamoune, Mener, Chapron &amp; Poimboeuf (2022) — Hypnotherapy and insomnia: A narrative review of the literature</w:t>
+        </w:r>
+      </w:hyperlink>
+      <w:r>
+        <w:rPr>
+          <w:rFonts w:ascii="Times New Roman" w:cs="Times New Roman" w:eastAsia="Times New Roman" w:hAnsi="Times New Roman"/>
+          <w:b w:val="false"/>
+          <w:bCs w:val="false"/>
+          <w:i w:val="false"/>
+          <w:iCs w:val="false"/>
+          <w:color w:val="1F2937"/>
+          <w:sz w:val="22"/>
+          <w:szCs w:val="22"/>
+        </w:rPr>
+        <w:t xml:space="preserve"> — Complementary Therapies in Medicine. 25 études, aucune en double aveugle. (notice PubMed, HTTP 203 ✅) [ajouté le 22/09/2026]</w:t>
+      </w:r>
+    </w:p>
+    <w:p>
+      <w:pPr>
+        <w:spacing w:after="60" w:before="60"/>
+      </w:pPr>
+      <w:hyperlink w:history="1" r:id="rIdC15marsh">
+        <w:r>
+          <w:rPr>
+            <w:rFonts w:ascii="Times New Roman" w:cs="Times New Roman" w:eastAsia="Times New Roman" w:hAnsi="Times New Roman"/>
+            <w:color w:val="1155CC"/>
+            <w:sz w:val="22"/>
+            <w:szCs w:val="22"/>
+            <w:u w:val="single"/>
+          </w:rPr>
+          <w:t xml:space="preserve">Marsh (2026) — Use of hypnosis to treat chronic somniloquy (sleep talking): a Case Report</w:t>
+        </w:r>
+      </w:hyperlink>
+      <w:r>
+        <w:rPr>
+          <w:rFonts w:ascii="Times New Roman" w:cs="Times New Roman" w:eastAsia="Times New Roman" w:hAnsi="Times New Roman"/>
+          <w:b w:val="false"/>
+          <w:bCs w:val="false"/>
+          <w:i w:val="false"/>
+          <w:iCs w:val="false"/>
+          <w:color w:val="1F2937"/>
+          <w:sz w:val="22"/>
+          <w:szCs w:val="22"/>
+        </w:rPr>
+        <w:t xml:space="preserve"> — Frontiers in Sleep. Cas unique, arrêt anticipé à la 6e séance. (HTTP 200 ✅) [ajouté le 22/09/2026]</w:t>
+      </w:r>
+    </w:p>
+    <w:p>
+      <w:pPr>
+        <w:spacing w:after="60" w:before="60"/>
+      </w:pPr>
+      <w:hyperlink w:history="1" r:id="rIdC15cordi22">
+        <w:r>
+          <w:rPr>
+            <w:rFonts w:ascii="Times New Roman" w:cs="Times New Roman" w:eastAsia="Times New Roman" w:hAnsi="Times New Roman"/>
+            <w:color w:val="1155CC"/>
+            <w:sz w:val="22"/>
+            <w:szCs w:val="22"/>
+            <w:u w:val="single"/>
+          </w:rPr>
+          <w:t xml:space="preserve">Cordi &amp; Rasch (2022) — Hypnotizability may relate to interoceptive ability to accurately perceive sleep depth: An exploratory study</w:t>
+        </w:r>
+      </w:hyperlink>
+      <w:r>
+        <w:rPr>
+          <w:rFonts w:ascii="Times New Roman" w:cs="Times New Roman" w:eastAsia="Times New Roman" w:hAnsi="Times New Roman"/>
+          <w:b w:val="false"/>
+          <w:bCs w:val="false"/>
+          <w:i w:val="false"/>
+          <w:iCs w:val="false"/>
+          <w:color w:val="1F2937"/>
+          <w:sz w:val="22"/>
+          <w:szCs w:val="22"/>
+        </w:rPr>
+        <w:t xml:space="preserve"> — International Journal of Clinical and Experimental Hypnosis. (notice PubMed 36227626, HTTP 203 ✅) [ajouté le 22/09/2026]</w:t>
+      </w:r>
+    </w:p>
+    <w:p>
+      <w:pPr>
+        <w:spacing w:after="60" w:before="60"/>
+      </w:pPr>
       <w:hyperlink w:history="1" r:id="rIdbs8ykjkmmlbkj39yll2gd">
         <w:r>
           <w:rPr>
@@ -1646,6 +1863,150 @@
           <w:szCs w:val="22"/>
         </w:rPr>
         <w:t xml:space="preserve">Après avoir exploré ce que l'hypnose peut apporter dans le contexte du sommeil, nous aborderons la face moins visible du sujet : pourquoi l'hypnose ne fonctionne pas pour tout le monde, quels sont les facteurs de résistance, et comment adapter la pratique ou choisir une approche alternative quand l'hypnose se révèle inefficace.</w:t>
+      </w:r>
+    </w:p>
+    <w:p>
+      <w:pPr>
+        <w:spacing w:after="120" w:before="320"/>
+      </w:pPr>
+      <w:r>
+        <w:rPr>
+          <w:rFonts w:ascii="Times New Roman" w:cs="Times New Roman" w:eastAsia="Times New Roman" w:hAnsi="Times New Roman"/>
+          <w:b/>
+          <w:bCs/>
+          <w:color w:val="1B3A6B"/>
+          <w:sz w:val="28"/>
+          <w:szCs w:val="28"/>
+        </w:rPr>
+        <w:t xml:space="preserve">📝 Journal des corrections — 22 septembre 2026</w:t>
+      </w:r>
+    </w:p>
+    <w:p>
+      <w:pPr>
+        <w:spacing w:after="60" w:before="60"/>
+      </w:pPr>
+      <w:r>
+        <w:rPr>
+          <w:rFonts w:ascii="Times New Roman" w:cs="Times New Roman" w:eastAsia="Times New Roman" w:hAnsi="Times New Roman"/>
+          <w:i/>
+          <w:iCs/>
+          <w:color w:val="6B7280"/>
+          <w:sz w:val="20"/>
+          <w:szCs w:val="20"/>
+        </w:rPr>
+        <w:t xml:space="preserve">Relecture du 22/09/2026 : les sept pages rouvertes, les notices bibliographiques relevées sur Europe PMC. Les corrections sont intégrées au texte, marquées [Corrigé le 22/09/2026 : …]. Formulations d'origine :</w:t>
+      </w:r>
+    </w:p>
+    <w:p>
+      <w:pPr>
+        <w:spacing w:after="60" w:before="60"/>
+      </w:pPr>
+      <w:r>
+        <w:rPr>
+          <w:rFonts w:ascii="Times New Roman" w:cs="Times New Roman" w:eastAsia="Times New Roman" w:hAnsi="Times New Roman"/>
+          <w:i/>
+          <w:iCs/>
+          <w:color w:val="6B7280"/>
+          <w:sz w:val="20"/>
+          <w:szCs w:val="20"/>
+        </w:rPr>
+        <w:t xml:space="preserve">• Théorie, Besedovsky 2022 : « tout en déplaçant l'équilibre sympathovagal vers une prédominance parasympathique réduite » — l'article dit « reduced sympathetic predominance », soit un basculement vers le parasympathique.</w:t>
+      </w:r>
+    </w:p>
+    <w:p>
+      <w:pPr>
+        <w:spacing w:after="60" w:before="60"/>
+      </w:pPr>
+      <w:r>
+        <w:rPr>
+          <w:rFonts w:ascii="Times New Roman" w:cs="Times New Roman" w:eastAsia="Times New Roman" w:hAnsi="Times New Roman"/>
+          <w:i/>
+          <w:iCs/>
+          <w:color w:val="6B7280"/>
+          <w:sz w:val="20"/>
+          <w:szCs w:val="20"/>
+        </w:rPr>
+        <w:t xml:space="preserve">• Théorie : « Une revue narrative publiée dans Complementary Therapies in Medicine (2022) a identifié les principales limites méthodologiques du champ : petits échantillons, absence de groupes contrôle, méthodes inconsistantes, focus sur le court terme, et biais de publication » — sans auteurs ni lien, et avec une liste qui n'est pas celle du résumé.</w:t>
+      </w:r>
+    </w:p>
+    <w:p>
+      <w:pPr>
+        <w:spacing w:after="60" w:before="60"/>
+      </w:pPr>
+      <w:r>
+        <w:rPr>
+          <w:rFonts w:ascii="Times New Roman" w:cs="Times New Roman" w:eastAsia="Times New Roman" w:hAnsi="Times New Roman"/>
+          <w:i/>
+          <w:iCs/>
+          <w:color w:val="6B7280"/>
+          <w:sz w:val="20"/>
+          <w:szCs w:val="20"/>
+        </w:rPr>
+        <w:t xml:space="preserve">• Théorie : « Snyder, Alldredge, Stork &amp; Elkins (2023, American Journal of Clinical Hypnosis) » — l'article est paru dans l'International Journal of Clinical and Experimental Hypnosis (deux fois dans la leçon, corps et ressources).</w:t>
+      </w:r>
+    </w:p>
+    <w:p>
+      <w:pPr>
+        <w:spacing w:after="60" w:before="60"/>
+      </w:pPr>
+      <w:r>
+        <w:rPr>
+          <w:rFonts w:ascii="Times New Roman" w:cs="Times New Roman" w:eastAsia="Times New Roman" w:hAnsi="Times New Roman"/>
+          <w:i/>
+          <w:iCs/>
+          <w:color w:val="6B7280"/>
+          <w:sz w:val="20"/>
+          <w:szCs w:val="20"/>
+        </w:rPr>
+        <w:t xml:space="preserve">• Théorie : « Marsh (2026, Frontiers in Sleep) sur la somniloquie chronique (8 séances bi-hebdomadaires) » — sans lien, et les huit séances étaient le plan : le traitement a été arrêté dès la sixième.</w:t>
+      </w:r>
+    </w:p>
+    <w:p>
+      <w:pPr>
+        <w:spacing w:after="60" w:before="60"/>
+      </w:pPr>
+      <w:r>
+        <w:rPr>
+          <w:rFonts w:ascii="Times New Roman" w:cs="Times New Roman" w:eastAsia="Times New Roman" w:hAnsi="Times New Roman"/>
+          <w:i/>
+          <w:iCs/>
+          <w:color w:val="6B7280"/>
+          <w:sz w:val="20"/>
+          <w:szCs w:val="20"/>
+        </w:rPr>
+        <w:t xml:space="preserve">• Exercice 2 : « Cette séance utilise une métaphore de descente progressive, adaptée de la technique validée par l'équipe de Rasch (imagerie d'approfondissement) » — l'imagerie validée est celle d'un dauphin, avec suggestions de sécurité ; une imagerie sans ces suggestions s'est révélée inefficace.</w:t>
+      </w:r>
+    </w:p>
+    <w:p>
+      <w:pPr>
+        <w:spacing w:after="60" w:before="60"/>
+      </w:pPr>
+      <w:r>
+        <w:rPr>
+          <w:rFonts w:ascii="Times New Roman" w:cs="Times New Roman" w:eastAsia="Times New Roman" w:hAnsi="Times New Roman"/>
+          <w:i/>
+          <w:iCs/>
+          <w:color w:val="6B7280"/>
+          <w:sz w:val="20"/>
+          <w:szCs w:val="20"/>
+        </w:rPr>
+        <w:t xml:space="preserve">• Exercice 3 : « Cordi &amp; Rasch (2022) ont montré que les personnes à haute hypnotisabilité ont une meilleure corrélation entre leur sommeil perçu et leur SWS réel » — le titre dit « may relate … An exploratory study », et la référence n'était pas dans les ressources.</w:t>
+      </w:r>
+    </w:p>
+    <w:p>
+      <w:pPr>
+        <w:spacing w:after="60" w:before="60"/>
+      </w:pPr>
+      <w:r>
+        <w:rPr>
+          <w:rFonts w:ascii="Times New Roman" w:cs="Times New Roman" w:eastAsia="Times New Roman" w:hAnsi="Times New Roman"/>
+          <w:i/>
+          <w:iCs/>
+          <w:color w:val="6B7280"/>
+          <w:sz w:val="20"/>
+          <w:szCs w:val="20"/>
+        </w:rPr>
+        <w:t xml:space="preserve">• Ressources : la revue narrative, le cas Marsh et Cordi &amp; Rasch (2022) étaient nommés dans le corps sans figurer dans les ressources ; les trois lignes sont ajoutées avec leur adresse.</w:t>
       </w:r>
     </w:p>
     <w:sectPr>

</xml_diff>